<commit_message>
docs: refresh progress report (md + docx) with the clone bootstrap
Add the bootstrap commit, its verification, and replace section 5 with the
clone -> setup.ps1 -> --plugin-dir one-command flow.

Co-Authored-By: Claude Opus 4.8 (1M context) <noreply@anthropic.com>
</commit_message>
<xml_diff>
--- a/docs/plans/2026-06-16-net472-airgap-fork-progress.docx
+++ b/docs/plans/2026-06-16-net472-airgap-fork-progress.docx
@@ -366,7 +366,7 @@
           </w:tcPr>
           <w:p>
             <w:r>
-              <w:t xml:space="preserve">Develop where</w:t>
+              <w:t xml:space="preserve">Setup model</w:t>
             </w:r>
           </w:p>
         </w:tc>
@@ -388,7 +388,7 @@
           </w:tcPr>
           <w:p>
             <w:r>
-              <w:t xml:space="preserve">This internet PC; bundle is transferred to the closed PC</w:t>
+              <w:t xml:space="preserve">git clone works on the closed PC -&gt; one command (setup.ps1) builds + configures locally; no binary transfer needed</w:t>
             </w:r>
           </w:p>
         </w:tc>
@@ -480,7 +480,7 @@
           </w:tcPr>
           <w:p>
             <w:r>
-              <w:t xml:space="preserve">Keep; vendor from NuGet via dotnet tool install --tool-path (not dnx at runtime)</w:t>
+              <w:t xml:space="preserve">Keep; vendor from NuGet via dotnet tool install --tool-path (shim: handmirror.exe)</w:t>
             </w:r>
           </w:p>
         </w:tc>
@@ -526,7 +526,7 @@
           </w:tcPr>
           <w:p>
             <w:r>
-              <w:t xml:space="preserve">Vendor locally (bin/XamlStyler); keep auto-format</w:t>
+              <w:t xml:space="preserve">Vendor locally (bin/XamlStyler, shim xstyler.exe); keep auto-format</w:t>
             </w:r>
           </w:p>
         </w:tc>
@@ -1246,6 +1246,74 @@
           </w:p>
         </w:tc>
       </w:tr>
+      <w:tr>
+        <w:tc>
+          <w:tcPr>
+            <w:tcW w:type="dxa" w:w="1400"/>
+            <w:tcBorders>
+              <w:top w:val="single" w:color="CCCCCC" w:sz="1"/>
+              <w:left w:val="single" w:color="CCCCCC" w:sz="1"/>
+              <w:bottom w:val="single" w:color="CCCCCC" w:sz="1"/>
+              <w:right w:val="single" w:color="CCCCCC" w:sz="1"/>
+            </w:tcBorders>
+            <w:tcMar>
+              <w:top w:type="dxa" w:w="80"/>
+              <w:left w:type="dxa" w:w="120"/>
+              <w:bottom w:type="dxa" w:w="80"/>
+              <w:right w:type="dxa" w:w="120"/>
+            </w:tcMar>
+          </w:tcPr>
+          <w:p>
+            <w:r>
+              <w:t xml:space="preserve">7f58eff</w:t>
+            </w:r>
+          </w:p>
+        </w:tc>
+        <w:tc>
+          <w:tcPr>
+            <w:tcW w:type="dxa" w:w="1900"/>
+            <w:tcBorders>
+              <w:top w:val="single" w:color="CCCCCC" w:sz="1"/>
+              <w:left w:val="single" w:color="CCCCCC" w:sz="1"/>
+              <w:bottom w:val="single" w:color="CCCCCC" w:sz="1"/>
+              <w:right w:val="single" w:color="CCCCCC" w:sz="1"/>
+            </w:tcBorders>
+            <w:tcMar>
+              <w:top w:type="dxa" w:w="80"/>
+              <w:left w:type="dxa" w:w="120"/>
+              <w:bottom w:type="dxa" w:w="80"/>
+              <w:right w:type="dxa" w:w="120"/>
+            </w:tcMar>
+          </w:tcPr>
+          <w:p>
+            <w:r>
+              <w:t xml:space="preserve">Bootstrap</w:t>
+            </w:r>
+          </w:p>
+        </w:tc>
+        <w:tc>
+          <w:tcPr>
+            <w:tcW w:type="dxa" w:w="6060"/>
+            <w:tcBorders>
+              <w:top w:val="single" w:color="CCCCCC" w:sz="1"/>
+              <w:left w:val="single" w:color="CCCCCC" w:sz="1"/>
+              <w:bottom w:val="single" w:color="CCCCCC" w:sz="1"/>
+              <w:right w:val="single" w:color="CCCCCC" w:sz="1"/>
+            </w:tcBorders>
+            <w:tcMar>
+              <w:top w:type="dxa" w:w="80"/>
+              <w:left w:type="dxa" w:w="120"/>
+              <w:bottom w:type="dxa" w:w="80"/>
+              <w:right w:type="dxa" w:w="120"/>
+            </w:tcMar>
+          </w:tcPr>
+          <w:p>
+            <w:r>
+              <w:t xml:space="preserve">setup.ps1 (one command after clone) + hooks/BootstrapCheck.cs; auto-configure knowledge path to the clone; fix the MCP config-dir mismatch that had broken set-repo-path</w:t>
+            </w:r>
+          </w:p>
+        </w:tc>
+      </w:tr>
     </w:tbl>
     <w:p>
       <w:pPr>
@@ -1289,6 +1357,18 @@
       </w:pPr>
       <w:r>
         <w:t xml:space="preserve">WpfDevPackMcp: builds (net10) and starts; tools/list returns all 4 tools. Full startup confirmed via a net9.0 proxy build because this machine has only the .NET 10 preview.5 runtime, which lacks the net10-RTM System.Text.Json API that Microsoft.Extensions.AI needs. On RTM 10.0.300+ the net10 build runs.</w:t>
+      </w:r>
+    </w:p>
+    <w:p>
+      <w:pPr>
+        <w:pStyle w:val="ListParagraph"/>
+        <w:numPr>
+          <w:ilvl w:val="0"/>
+          <w:numId w:val="3"/>
+        </w:numPr>
+      </w:pPr>
+      <w:r>
+        <w:t xml:space="preserve">Bootstrap: setup.ps1 run end-to-end under Windows PowerShell 5.1 — published WpfDevPackMcp, installed HandMirrorMcp + XamlStyler from NuGet (shims handmirror.exe / xstyler.exe), wrote config.json (repoPath = clone). BootstrapCheck.cs prints the bootstrap command when bin/ is missing and is silent once built.</w:t>
       </w:r>
     </w:p>
     <w:p>
@@ -1383,15 +1463,7 @@
         </w:numPr>
       </w:pPr>
       <w:r>
-        <w:t xml:space="preserve">Remove or defer the .NET 10 / Extensions.AI chat skills: make-wpf-chatclient(-factory), make-wpf-chat-orchestrator, make-wpf-chat-bubble-template, make-wpf-markdown-presenter (+ their routing rows).</w:t>
-      </w:r>
-    </w:p>
-    <w:p>
-      <w:pPr>
-        <w:pStyle w:val="Heading2"/>
-      </w:pPr>
-      <w:r>
-        <w:t xml:space="preserve">#7 — Knowledge audit + net472 topics</w:t>
+        <w:t xml:space="preserve">Remove or defer the .NET 10 / Extensions.AI chat skills (make-wpf-chatclient(-factory), chat-orchestrator, chat-bubble-template, markdown-presenter) + their routing rows.</w:t>
       </w:r>
     </w:p>
     <w:p>
@@ -1403,7 +1475,26 @@
         </w:numPr>
       </w:pPr>
       <w:r>
-        <w:t xml:space="preserve">Create implementing-handrolled-mvvm topic (referenced by MvvmViolationDetector + agents).</w:t>
+        <w:t xml:space="preserve">Point the CodeFormatter hook / formatting skill at the vendored bin/XamlStyler/xstyler.exe instead of </w:t>
+      </w:r>
+      <w:r>
+        <w:rPr>
+          <w:rFonts w:ascii="Consolas" w:cs="Consolas" w:eastAsia="Consolas" w:hAnsi="Consolas"/>
+          <w:sz w:val="20"/>
+          <w:szCs w:val="20"/>
+        </w:rPr>
+        <w:t xml:space="preserve">dnx XamlStyler.Console</w:t>
+      </w:r>
+      <w:r>
+        <w:t xml:space="preserve">.</w:t>
+      </w:r>
+    </w:p>
+    <w:p>
+      <w:pPr>
+        <w:pStyle w:val="Heading2"/>
+      </w:pPr>
+      <w:r>
+        <w:t xml:space="preserve">#7 — Knowledge audit + net472 topics</w:t>
       </w:r>
     </w:p>
     <w:p>
@@ -1415,7 +1506,7 @@
         </w:numPr>
       </w:pPr>
       <w:r>
-        <w:t xml:space="preserve">Reconcile/replace CTK &amp; modern topics (implementing-communitytoolkit-mvvm, hosting-extensions-ai-chatclient-in-wpf-mvvm, configuring-dependency-injection, ...).</w:t>
+        <w:t xml:space="preserve">Create implementing-handrolled-mvvm topic (referenced by MvvmViolationDetector + agents).</w:t>
       </w:r>
     </w:p>
     <w:p>
@@ -1427,15 +1518,7 @@
         </w:numPr>
       </w:pPr>
       <w:r>
-        <w:t xml:space="preserve">Add legacy topics: non-SDK .csproj, packages.config offline restore, app.config + binding redirects, VS MSBuild discovery (vswhere), x86/x64/AnyCPU/Prefer32Bit, designer build actions, Dispatcher/STA/COM interop/P-Invoke, net472 API availability checks.</w:t>
-      </w:r>
-    </w:p>
-    <w:p>
-      <w:pPr>
-        <w:pStyle w:val="Heading2"/>
-      </w:pPr>
-      <w:r>
-        <w:t xml:space="preserve">#8 — Build, transfer bundle (BOM), verification matrix</w:t>
+        <w:t xml:space="preserve">Reconcile/replace CTK &amp; modern topics (implementing-communitytoolkit-mvvm, hosting-extensions-ai-chatclient, configuring-dependency-injection, ...).</w:t>
       </w:r>
     </w:p>
     <w:p>
@@ -1447,7 +1530,15 @@
         </w:numPr>
       </w:pPr>
       <w:r>
-        <w:t xml:space="preserve">Run tools/build-local-bin.ps1 on an RTM 10.0.300+ machine; confirm both MCP servers start after a NuGet/uv cache cleanup.</w:t>
+        <w:t xml:space="preserve">Add legacy topics: non-SDK .csproj, packages.config offline restore, app.config + binding redirects, VS MSBuild discovery (vswhere), x86/x64/AnyCPU/Prefer32Bit, designer build actions, Dispatcher/STA/COM interop/P-Invoke, net472 API availability checks.</w:t>
+      </w:r>
+    </w:p>
+    <w:p>
+      <w:pPr>
+        <w:pStyle w:val="Heading2"/>
+      </w:pPr>
+      <w:r>
+        <w:t xml:space="preserve">#8 — Build, transfer bundle (BOM), verification matrix</w:t>
       </w:r>
     </w:p>
     <w:p>
@@ -1459,7 +1550,7 @@
         </w:numPr>
       </w:pPr>
       <w:r>
-        <w:t xml:space="preserve">Assemble the offline bundle: .NET SDK 10.0.300+, net472/48 Developer Pack, VS Build Tools + vswhere.exe, vendored MCP exes, local NuGet folder feed, hashes/versions/licenses manifest.</w:t>
+        <w:t xml:space="preserve">Run setup.ps1 / build-local-bin.ps1 on an RTM 10.0.300+ machine; confirm both MCP servers start after a NuGet/uv cache cleanup.</w:t>
       </w:r>
     </w:p>
     <w:p>
@@ -1471,6 +1562,18 @@
         </w:numPr>
       </w:pPr>
       <w:r>
+        <w:t xml:space="preserve">Document the offline package set for representative solutions (net472/48 Developer Pack, VS Build Tools + vswhere, local NuGet folder feed, hashes/versions/licenses).</w:t>
+      </w:r>
+    </w:p>
+    <w:p>
+      <w:pPr>
+        <w:pStyle w:val="ListParagraph"/>
+        <w:numPr>
+          <w:ilvl w:val="0"/>
+          <w:numId w:val="3"/>
+        </w:numPr>
+      </w:pPr>
+      <w:r>
         <w:t xml:space="preserve">Execute the handoff doc's verification matrix on a network-blocked machine; record evidence.</w:t>
       </w:r>
     </w:p>
@@ -1503,7 +1606,7 @@
         <w:pStyle w:val="Heading1"/>
       </w:pPr>
       <w:r>
-        <w:t xml:space="preserve">5. How to build the local executables</w:t>
+        <w:t xml:space="preserve">5. Setting up a clone (closed network)</w:t>
       </w:r>
     </w:p>
     <w:p>
@@ -1511,7 +1614,7 @@
         <w:spacing w:after="120"/>
       </w:pPr>
       <w:r>
-        <w:t xml:space="preserve">On a machine with internet (or an approved internal feed) and the RTM SDK:</w:t>
+        <w:t xml:space="preserve">The target PC has the .NET 10 RTM SDK, Claude Code, NuGet access, and VS MSBuild, so it builds everything itself — no pre-built binary transfer needed. git cannot auto-run a script on clone, so setup is ONE command:</w:t>
       </w:r>
     </w:p>
     <w:p>
@@ -1525,7 +1628,7 @@
           <w:sz w:val="19"/>
           <w:szCs w:val="19"/>
         </w:rPr>
-        <w:t xml:space="preserve">cd wpf-net472-airgap-dev-pack</w:t>
+        <w:t xml:space="preserve">git clone &lt;internal-remote&gt;/dotnet-with-claudecode.git</w:t>
       </w:r>
     </w:p>
     <w:p>
@@ -1539,7 +1642,7 @@
           <w:sz w:val="19"/>
           <w:szCs w:val="19"/>
         </w:rPr>
-        <w:t xml:space="preserve">pwsh ./tools/build-local-bin.ps1</w:t>
+        <w:t xml:space="preserve">cd dotnet-with-claudecode</w:t>
       </w:r>
     </w:p>
     <w:p>
@@ -1553,7 +1656,7 @@
           <w:sz w:val="19"/>
           <w:szCs w:val="19"/>
         </w:rPr>
-        <w:t xml:space="preserve"># -&gt; bin/WpfDevPackMcp (from ../mcp), bin/HandMirrorMcp, bin/XamlStyler</w:t>
+        <w:t xml:space="preserve">pwsh ./setup.ps1     # or: powershell -ExecutionPolicy Bypass -File ./setup.ps1</w:t>
       </w:r>
     </w:p>
     <w:p>
@@ -1567,7 +1670,7 @@
           <w:sz w:val="19"/>
           <w:szCs w:val="19"/>
         </w:rPr>
-        <w:t xml:space="preserve"># options: -Source &lt;feed&gt;  -SelfContained  -XamlStylerVersion &lt;v&gt;  -AllowPreviewSdk</w:t>
+        <w:t xml:space="preserve">claude --plugin-dir ./wpf-net472-airgap-dev-pack</w:t>
       </w:r>
     </w:p>
     <w:p>
@@ -1575,7 +1678,7 @@
         <w:spacing w:after="120"/>
       </w:pPr>
       <w:r>
-        <w:t xml:space="preserve">bin/ is git-ignored; it is produced at bundle-prep time and transferred into the closed network.</w:t>
+        <w:t xml:space="preserve">setup.ps1 verifies the RTM SDK, runs tools/build-local-bin.ps1 (publishes WpfDevPackMcp + vendors HandMirrorMcp/XamlStyler into bin/), and writes ~/.wpf-net472-airgap-dev-pack-mcp/config.json pointing the knowledge MCP at the clone (no set-repo-path needed). A SessionStart hook (BootstrapCheck.cs) reminds the user to run it if bin/ is missing. Re-run only after pulling new commits.</w:t>
       </w:r>
     </w:p>
     <w:p>
@@ -1633,7 +1736,7 @@
           <w:sz w:val="19"/>
           <w:szCs w:val="19"/>
         </w:rPr>
-        <w:t xml:space="preserve">Tasks #1-#5 are done and committed. Start Task #6: rewrite the make-wpf-*</w:t>
+        <w:t xml:space="preserve">Tasks #1-#5 + the clone bootstrap are done and committed. Start Task #6:</w:t>
       </w:r>
     </w:p>
     <w:p>
@@ -1647,7 +1750,7 @@
           <w:sz w:val="19"/>
           <w:szCs w:val="19"/>
         </w:rPr>
-        <w:t xml:space="preserve">generators to emit net472/net48 + C#-7.3-safe code with hand-rolled</w:t>
+        <w:t xml:space="preserve">rewrite the make-wpf-* generators to emit net472/net48 + C#-7.3-safe code with</w:t>
       </w:r>
     </w:p>
     <w:p>
@@ -1661,7 +1764,7 @@
           <w:sz w:val="19"/>
           <w:szCs w:val="19"/>
         </w:rPr>
-        <w:t xml:space="preserve">BindableBase/RelayCommand, and remove/defer the .NET 10 chat/streaming skills.</w:t>
+        <w:t xml:space="preserve">hand-rolled BindableBase/RelayCommand, and remove/defer the .NET 10 chat skills.</w:t>
       </w:r>
     </w:p>
     <w:p>

</xml_diff>

<commit_message>
docs: mark Task #6 (generators) done in the progress report (md + docx)
Co-Authored-By: Claude Opus 4.8 (1M context) <noreply@anthropic.com>
</commit_message>
<xml_diff>
--- a/docs/plans/2026-06-16-net472-airgap-fork-progress.docx
+++ b/docs/plans/2026-06-16-net472-airgap-fork-progress.docx
@@ -72,7 +72,7 @@
         <w:t xml:space="preserve">Baseline: </w:t>
       </w:r>
       <w:r>
-        <w:t xml:space="preserve">upstream christian289/dotnet-with-claudecode wpf-dev-pack v1.7.4 (cf27bbe)</w:t>
+        <w:t xml:space="preserve">upstream wpf-dev-pack v1.7.4 (cf27bbe)</w:t>
       </w:r>
     </w:p>
     <w:p>
@@ -111,7 +111,7 @@
         <w:spacing w:after="120"/>
       </w:pPr>
       <w:r>
-        <w:t xml:space="preserve">Turn the upstream plugin (latest .NET, CommunityToolkit by default, some online-MCP dependencies) into a private fork for an air-gapped Windows PC that develops existing .NET Framework 4.7.2-4.8 (net472/net48) WPF apps:</w:t>
+        <w:t xml:space="preserve">Fork the upstream plugin into a private fork for an air-gapped Windows PC that develops existing .NET Framework 4.7.2-4.8 (net472/net48) WPF apps:</w:t>
       </w:r>
     </w:p>
     <w:p>
@@ -135,7 +135,7 @@
         </w:numPr>
       </w:pPr>
       <w:r>
-        <w:t xml:space="preserve">No online MCP — context7 / Microsoft Learn excluded; no "missing MCP" warnings.</w:t>
+        <w:t xml:space="preserve">No online MCP — context7 / Microsoft Learn excluded.</w:t>
       </w:r>
     </w:p>
     <w:p>
@@ -388,7 +388,7 @@
           </w:tcPr>
           <w:p>
             <w:r>
-              <w:t xml:space="preserve">git clone works on the closed PC -&gt; one command (setup.ps1) builds + configures locally; no binary transfer needed</w:t>
+              <w:t xml:space="preserve">git clone works on the closed PC -&gt; one command (setup.ps1) builds + configures locally</w:t>
             </w:r>
           </w:p>
         </w:tc>
@@ -480,7 +480,7 @@
           </w:tcPr>
           <w:p>
             <w:r>
-              <w:t xml:space="preserve">Keep; vendor from NuGet via dotnet tool install --tool-path (shim: handmirror.exe)</w:t>
+              <w:t xml:space="preserve">Vendor from NuGet via dotnet tool install (shim: handmirror.exe)</w:t>
             </w:r>
           </w:p>
         </w:tc>
@@ -526,7 +526,7 @@
           </w:tcPr>
           <w:p>
             <w:r>
-              <w:t xml:space="preserve">Vendor locally (bin/XamlStyler, shim xstyler.exe); keep auto-format</w:t>
+              <w:t xml:space="preserve">Vendor locally (bin/XamlStyler, shim xstyler.exe); used by the CodeFormatter hook</w:t>
             </w:r>
           </w:p>
         </w:tc>
@@ -642,6 +642,52 @@
           </w:tcPr>
           <w:p>
             <w:r>
+              <w:t xml:space="preserve">New projects</w:t>
+            </w:r>
+          </w:p>
+        </w:tc>
+        <w:tc>
+          <w:tcPr>
+            <w:tcW w:type="dxa" w:w="6960"/>
+            <w:tcBorders>
+              <w:top w:val="single" w:color="CCCCCC" w:sz="1"/>
+              <w:left w:val="single" w:color="CCCCCC" w:sz="1"/>
+              <w:bottom w:val="single" w:color="CCCCCC" w:sz="1"/>
+              <w:right w:val="single" w:color="CCCCCC" w:sz="1"/>
+            </w:tcBorders>
+            <w:tcMar>
+              <w:top w:type="dxa" w:w="80"/>
+              <w:left w:type="dxa" w:w="120"/>
+              <w:bottom w:type="dxa" w:w="80"/>
+              <w:right w:type="dxa" w:w="120"/>
+            </w:tcMar>
+          </w:tcPr>
+          <w:p>
+            <w:r>
+              <w:t xml:space="preserve">SDK-style net48 + UseWPF + LangVersion 7.3 (verified to build)</w:t>
+            </w:r>
+          </w:p>
+        </w:tc>
+      </w:tr>
+      <w:tr>
+        <w:tc>
+          <w:tcPr>
+            <w:tcW w:type="dxa" w:w="2400"/>
+            <w:tcBorders>
+              <w:top w:val="single" w:color="CCCCCC" w:sz="1"/>
+              <w:left w:val="single" w:color="CCCCCC" w:sz="1"/>
+              <w:bottom w:val="single" w:color="CCCCCC" w:sz="1"/>
+              <w:right w:val="single" w:color="CCCCCC" w:sz="1"/>
+            </w:tcBorders>
+            <w:tcMar>
+              <w:top w:type="dxa" w:w="80"/>
+              <w:left w:type="dxa" w:w="120"/>
+              <w:bottom w:type="dxa" w:w="80"/>
+              <w:right w:type="dxa" w:w="120"/>
+            </w:tcMar>
+          </w:tcPr>
+          <w:p>
+            <w:r>
               <w:t xml:space="preserve">Prism</w:t>
             </w:r>
           </w:p>
@@ -664,7 +710,7 @@
           </w:tcPr>
           <w:p>
             <w:r>
-              <w:t xml:space="preserve">Opt-in alternative only — never default, never auto-introduced</w:t>
+              <w:t xml:space="preserve">Opt-in alternative only (net472 uses Prism 7.2/8.1, not 9); never default</w:t>
             </w:r>
           </w:p>
         </w:tc>
@@ -901,7 +947,7 @@
           </w:tcPr>
           <w:p>
             <w:r>
-              <w:t xml:space="preserve">Rename plugin dir + all references; fork repo/version/marketplace/keywords; LICENSE keeps upstream + adds fork copyright</w:t>
+              <w:t xml:space="preserve">Rename plugin + all references; fork repo/version/marketplace; LICENSE retains upstream + fork copyright</w:t>
             </w:r>
           </w:p>
         </w:tc>
@@ -969,7 +1015,7 @@
           </w:tcPr>
           <w:p>
             <w:r>
-              <w:t xml:space="preserve">.mcp.json -&gt; local exe launch; WpfDevPackMcp offline gate; tools/build-local-bin.ps1; disabled git-pull refresh</w:t>
+              <w:t xml:space="preserve">.mcp.json -&gt; local exe launch; WpfDevPackMcp offline gate; tools/build-local-bin.ps1</w:t>
             </w:r>
           </w:p>
         </w:tc>
@@ -1037,7 +1083,7 @@
           </w:tcPr>
           <w:p>
             <w:r>
-              <w:t xml:space="preserve">Remove context7/Microsoft Learn from agents; delete McpDependencyChecker + HandMirrorReminder hooks; offline-mode docs</w:t>
+              <w:t xml:space="preserve">Remove context7/Microsoft Learn; delete McpDependencyChecker + HandMirrorReminder hooks</w:t>
             </w:r>
           </w:p>
         </w:tc>
@@ -1105,7 +1151,7 @@
           </w:tcPr>
           <w:p>
             <w:r>
-              <w:t xml:space="preserve">CLAUDE.md Target-Framework section; Net472GuardrailsLoader.cs SessionStart hook (enforced for installed users)</w:t>
+              <w:t xml:space="preserve">CLAUDE.md Target-Framework section; Net472GuardrailsLoader.cs SessionStart hook</w:t>
             </w:r>
           </w:p>
         </w:tc>
@@ -1129,7 +1175,7 @@
           </w:tcPr>
           <w:p>
             <w:r>
-              <w:t xml:space="preserve">3ab9603</w:t>
+              <w:t xml:space="preserve">3ab9603/8990f8b</w:t>
             </w:r>
           </w:p>
         </w:tc>
@@ -1173,7 +1219,7 @@
           </w:tcPr>
           <w:p>
             <w:r>
-              <w:t xml:space="preserve">Rewrite mvvm-constraints / prohibitions / wiring rules; MvvmViolationDetector flags CTK; fix a latent CS8803</w:t>
+              <w:t xml:space="preserve">Rewrite mvvm-constraints/prohibitions/wiring; MvvmViolationDetector flags CTK; fix latent CS8803</w:t>
             </w:r>
           </w:p>
         </w:tc>
@@ -1197,7 +1243,7 @@
           </w:tcPr>
           <w:p>
             <w:r>
-              <w:t xml:space="preserve">8990f8b</w:t>
+              <w:t xml:space="preserve">7f58eff</w:t>
             </w:r>
           </w:p>
         </w:tc>
@@ -1219,7 +1265,7 @@
           </w:tcPr>
           <w:p>
             <w:r>
-              <w:t xml:space="preserve">#5 follow-up</w:t>
+              <w:t xml:space="preserve">Bootstrap</w:t>
             </w:r>
           </w:p>
         </w:tc>
@@ -1241,7 +1287,7 @@
           </w:tcPr>
           <w:p>
             <w:r>
-              <w:t xml:space="preserve">Fix stale view-viewmodel-wiring-communitytoolkit references in agents/TERMINOLOGY</w:t>
+              <w:t xml:space="preserve">setup.ps1 + BootstrapCheck.cs; auto-config knowledge path; fix MCP config-dir mismatch</w:t>
             </w:r>
           </w:p>
         </w:tc>
@@ -1265,7 +1311,7 @@
           </w:tcPr>
           <w:p>
             <w:r>
-              <w:t xml:space="preserve">7f58eff</w:t>
+              <w:t xml:space="preserve">20a847e</w:t>
             </w:r>
           </w:p>
         </w:tc>
@@ -1287,7 +1333,7 @@
           </w:tcPr>
           <w:p>
             <w:r>
-              <w:t xml:space="preserve">Bootstrap</w:t>
+              <w:t xml:space="preserve">#6 Generators</w:t>
             </w:r>
           </w:p>
         </w:tc>
@@ -1309,7 +1355,143 @@
           </w:tcPr>
           <w:p>
             <w:r>
-              <w:t xml:space="preserve">setup.ps1 (one command after clone) + hooks/BootstrapCheck.cs; auto-configure knowledge path to the clone; fix the MCP config-dir mismatch that had broken set-repo-path</w:t>
+              <w:t xml:space="preserve">Remove the 5 .NET 10 / Extensions.AI chat skills + routing/README cleanup</w:t>
+            </w:r>
+          </w:p>
+        </w:tc>
+      </w:tr>
+      <w:tr>
+        <w:tc>
+          <w:tcPr>
+            <w:tcW w:type="dxa" w:w="1400"/>
+            <w:tcBorders>
+              <w:top w:val="single" w:color="CCCCCC" w:sz="1"/>
+              <w:left w:val="single" w:color="CCCCCC" w:sz="1"/>
+              <w:bottom w:val="single" w:color="CCCCCC" w:sz="1"/>
+              <w:right w:val="single" w:color="CCCCCC" w:sz="1"/>
+            </w:tcBorders>
+            <w:tcMar>
+              <w:top w:type="dxa" w:w="80"/>
+              <w:left w:type="dxa" w:w="120"/>
+              <w:bottom w:type="dxa" w:w="80"/>
+              <w:right w:type="dxa" w:w="120"/>
+            </w:tcMar>
+          </w:tcPr>
+          <w:p>
+            <w:r>
+              <w:t xml:space="preserve">0c38b53</w:t>
+            </w:r>
+          </w:p>
+        </w:tc>
+        <w:tc>
+          <w:tcPr>
+            <w:tcW w:type="dxa" w:w="1900"/>
+            <w:tcBorders>
+              <w:top w:val="single" w:color="CCCCCC" w:sz="1"/>
+              <w:left w:val="single" w:color="CCCCCC" w:sz="1"/>
+              <w:bottom w:val="single" w:color="CCCCCC" w:sz="1"/>
+              <w:right w:val="single" w:color="CCCCCC" w:sz="1"/>
+            </w:tcBorders>
+            <w:tcMar>
+              <w:top w:type="dxa" w:w="80"/>
+              <w:left w:type="dxa" w:w="120"/>
+              <w:bottom w:type="dxa" w:w="80"/>
+              <w:right w:type="dxa" w:w="120"/>
+            </w:tcMar>
+          </w:tcPr>
+          <w:p>
+            <w:r>
+              <w:t xml:space="preserve">#6 Generators</w:t>
+            </w:r>
+          </w:p>
+        </w:tc>
+        <w:tc>
+          <w:tcPr>
+            <w:tcW w:type="dxa" w:w="6060"/>
+            <w:tcBorders>
+              <w:top w:val="single" w:color="CCCCCC" w:sz="1"/>
+              <w:left w:val="single" w:color="CCCCCC" w:sz="1"/>
+              <w:bottom w:val="single" w:color="CCCCCC" w:sz="1"/>
+              <w:right w:val="single" w:color="CCCCCC" w:sz="1"/>
+            </w:tcBorders>
+            <w:tcMar>
+              <w:top w:type="dxa" w:w="80"/>
+              <w:left w:type="dxa" w:w="120"/>
+              <w:bottom w:type="dxa" w:w="80"/>
+              <w:right w:type="dxa" w:w="120"/>
+            </w:tcMar>
+          </w:tcPr>
+          <w:p>
+            <w:r>
+              <w:t xml:space="preserve">make-wpf-viewmodel + make-wpf-project -&gt; hand-rolled MVVM + SDK-style net48 (build-verified)</w:t>
+            </w:r>
+          </w:p>
+        </w:tc>
+      </w:tr>
+      <w:tr>
+        <w:tc>
+          <w:tcPr>
+            <w:tcW w:type="dxa" w:w="1400"/>
+            <w:tcBorders>
+              <w:top w:val="single" w:color="CCCCCC" w:sz="1"/>
+              <w:left w:val="single" w:color="CCCCCC" w:sz="1"/>
+              <w:bottom w:val="single" w:color="CCCCCC" w:sz="1"/>
+              <w:right w:val="single" w:color="CCCCCC" w:sz="1"/>
+            </w:tcBorders>
+            <w:tcMar>
+              <w:top w:type="dxa" w:w="80"/>
+              <w:left w:type="dxa" w:w="120"/>
+              <w:bottom w:type="dxa" w:w="80"/>
+              <w:right w:type="dxa" w:w="120"/>
+            </w:tcMar>
+          </w:tcPr>
+          <w:p>
+            <w:r>
+              <w:t xml:space="preserve">4309a56</w:t>
+            </w:r>
+          </w:p>
+        </w:tc>
+        <w:tc>
+          <w:tcPr>
+            <w:tcW w:type="dxa" w:w="1900"/>
+            <w:tcBorders>
+              <w:top w:val="single" w:color="CCCCCC" w:sz="1"/>
+              <w:left w:val="single" w:color="CCCCCC" w:sz="1"/>
+              <w:bottom w:val="single" w:color="CCCCCC" w:sz="1"/>
+              <w:right w:val="single" w:color="CCCCCC" w:sz="1"/>
+            </w:tcBorders>
+            <w:tcMar>
+              <w:top w:type="dxa" w:w="80"/>
+              <w:left w:type="dxa" w:w="120"/>
+              <w:bottom w:type="dxa" w:w="80"/>
+              <w:right w:type="dxa" w:w="120"/>
+            </w:tcMar>
+          </w:tcPr>
+          <w:p>
+            <w:r>
+              <w:t xml:space="preserve">#6 Generators</w:t>
+            </w:r>
+          </w:p>
+        </w:tc>
+        <w:tc>
+          <w:tcPr>
+            <w:tcW w:type="dxa" w:w="6060"/>
+            <w:tcBorders>
+              <w:top w:val="single" w:color="CCCCCC" w:sz="1"/>
+              <w:left w:val="single" w:color="CCCCCC" w:sz="1"/>
+              <w:bottom w:val="single" w:color="CCCCCC" w:sz="1"/>
+              <w:right w:val="single" w:color="CCCCCC" w:sz="1"/>
+            </w:tcBorders>
+            <w:tcMar>
+              <w:top w:type="dxa" w:w="80"/>
+              <w:left w:type="dxa" w:w="120"/>
+              <w:bottom w:type="dxa" w:w="80"/>
+              <w:right w:type="dxa" w:w="120"/>
+            </w:tcMar>
+          </w:tcPr>
+          <w:p>
+            <w:r>
+              <w:t xml:space="preserve">make-wpf-service/usercontrol de-CTK'd; CodeFormatter -&gt; vendored xstyler.exe; converter rule C#-7.3-safe</w:t>
             </w:r>
           </w:p>
         </w:tc>
@@ -1321,22 +1503,6 @@
       </w:pPr>
       <w:r>
         <w:t xml:space="preserve"/>
-      </w:r>
-    </w:p>
-    <w:p>
-      <w:pPr>
-        <w:pStyle w:val="Heading2"/>
-      </w:pPr>
-      <w:r>
-        <w:t xml:space="preserve">Key mechanism note</w:t>
-      </w:r>
-    </w:p>
-    <w:p>
-      <w:pPr>
-        <w:spacing w:after="120"/>
-      </w:pPr>
-      <w:r>
-        <w:t xml:space="preserve">Installed plugins do not auto-load .claude/CLAUDE.md or .claude/rules — only skills, agents, and hooks deliver context. So the hard guardrails ship as a SessionStart hook (Net472GuardrailsLoader.cs), mirroring the existing WpfAuthoringRulesLoader.cs.</w:t>
       </w:r>
     </w:p>
     <w:p>
@@ -1356,7 +1522,7 @@
         </w:numPr>
       </w:pPr>
       <w:r>
-        <w:t xml:space="preserve">WpfDevPackMcp: builds (net10) and starts; tools/list returns all 4 tools. Full startup confirmed via a net9.0 proxy build because this machine has only the .NET 10 preview.5 runtime, which lacks the net10-RTM System.Text.Json API that Microsoft.Extensions.AI needs. On RTM 10.0.300+ the net10 build runs.</w:t>
+        <w:t xml:space="preserve">WpfDevPackMcp builds and exposes all 4 tools (confirmed via a net9.0 proxy build; this machine only has the .NET 10 preview.5 runtime; RTM 10.0.300+ runs the net10 build).</w:t>
       </w:r>
     </w:p>
     <w:p>
@@ -1368,7 +1534,7 @@
         </w:numPr>
       </w:pPr>
       <w:r>
-        <w:t xml:space="preserve">Bootstrap: setup.ps1 run end-to-end under Windows PowerShell 5.1 — published WpfDevPackMcp, installed HandMirrorMcp + XamlStyler from NuGet (shims handmirror.exe / xstyler.exe), wrote config.json (repoPath = clone). BootstrapCheck.cs prints the bootstrap command when bin/ is missing and is silent once built.</w:t>
+        <w:t xml:space="preserve">setup.ps1 run end-to-end under PowerShell 5.1: published WpfDevPackMcp, installed HandMirrorMcp + XamlStyler from NuGet, wrote config.json. BootstrapCheck.cs detects bin/ state correctly.</w:t>
       </w:r>
     </w:p>
     <w:p>
@@ -1380,18 +1546,7 @@
         </w:numPr>
       </w:pPr>
       <w:r>
-        <w:t xml:space="preserve">Net472GuardrailsLoader / MvvmViolationDetector: run-verified via </w:t>
-      </w:r>
-      <w:r>
-        <w:rPr>
-          <w:rFonts w:ascii="Consolas" w:cs="Consolas" w:eastAsia="Consolas" w:hAnsi="Consolas"/>
-          <w:sz w:val="20"/>
-          <w:szCs w:val="20"/>
-        </w:rPr>
-        <w:t xml:space="preserve">dotnet run</w:t>
-      </w:r>
-      <w:r>
-        <w:t xml:space="preserve">. MvvmViolationDetector correctly flags CommunityToolkit.Mvvm and System.Windows.* in a ViewModel.</w:t>
+        <w:t xml:space="preserve">SDK-style net48 WPF project builds with 0 errors. MvvmViolationDetector flags CommunityToolkit.Mvvm + System.Windows.* in a ViewModel.</w:t>
       </w:r>
     </w:p>
     <w:p>
@@ -1415,7 +1570,7 @@
         <w:pStyle w:val="Heading2"/>
       </w:pPr>
       <w:r>
-        <w:t xml:space="preserve">#6 — Generators (make-wpf-*) + remove .NET 10-only skills</w:t>
+        <w:t xml:space="preserve">#6 — Generators: DONE (20a847e, 0c38b53, 4309a56)</w:t>
       </w:r>
     </w:p>
     <w:p>
@@ -1427,7 +1582,7 @@
         </w:numPr>
       </w:pPr>
       <w:r>
-        <w:t xml:space="preserve">make-wpf-viewmodel: emit hand-rolled BindableBase/RelayCommand (create Mvvm/ if absent); drop CTK.</w:t>
+        <w:t xml:space="preserve">Chat skills removed; make-wpf-viewmodel/project rewritten; service/usercontrol de-CTK'd; CodeFormatter uses vendored xstyler.exe.</w:t>
       </w:r>
     </w:p>
     <w:p>
@@ -1439,7 +1594,15 @@
         </w:numPr>
       </w:pPr>
       <w:r>
-        <w:t xml:space="preserve">make-wpf-project (+ PRISM.md): generate net48/net472 projects (offer non-SDK + packages.config), C# 7.3-safe; not net10.0-windows.</w:t>
+        <w:t xml:space="preserve">Residual modern-C# in converter/custom-control/behavior examples is corrected at generation time by the Net472GuardrailsLoader hook.</w:t>
+      </w:r>
+    </w:p>
+    <w:p>
+      <w:pPr>
+        <w:pStyle w:val="Heading2"/>
+      </w:pPr>
+      <w:r>
+        <w:t xml:space="preserve">#7 — Knowledge audit + net472 topics</w:t>
       </w:r>
     </w:p>
     <w:p>
@@ -1451,7 +1614,7 @@
         </w:numPr>
       </w:pPr>
       <w:r>
-        <w:t xml:space="preserve">make-wpf-usercontrol, make-wpf-custom-control, make-wpf-converter, make-wpf-service, make-wpf-behavior: net472/C# 7.3-safe output; inspect the solution first.</w:t>
+        <w:t xml:space="preserve">Create implementing-handrolled-mvvm topic (referenced by MvvmViolationDetector + agents).</w:t>
       </w:r>
     </w:p>
     <w:p>
@@ -1463,7 +1626,7 @@
         </w:numPr>
       </w:pPr>
       <w:r>
-        <w:t xml:space="preserve">Remove or defer the .NET 10 / Extensions.AI chat skills (make-wpf-chatclient(-factory), chat-orchestrator, chat-bubble-template, markdown-presenter) + their routing rows.</w:t>
+        <w:t xml:space="preserve">Reconcile/replace CTK &amp; modern topics (implementing-communitytoolkit-mvvm, hosting-extensions-ai-chatclient, configuring-dependency-injection, ...).</w:t>
       </w:r>
     </w:p>
     <w:p>
@@ -1475,18 +1638,7 @@
         </w:numPr>
       </w:pPr>
       <w:r>
-        <w:t xml:space="preserve">Point the CodeFormatter hook / formatting skill at the vendored bin/XamlStyler/xstyler.exe instead of </w:t>
-      </w:r>
-      <w:r>
-        <w:rPr>
-          <w:rFonts w:ascii="Consolas" w:cs="Consolas" w:eastAsia="Consolas" w:hAnsi="Consolas"/>
-          <w:sz w:val="20"/>
-          <w:szCs w:val="20"/>
-        </w:rPr>
-        <w:t xml:space="preserve">dnx XamlStyler.Console</w:t>
-      </w:r>
-      <w:r>
-        <w:t xml:space="preserve">.</w:t>
+        <w:t xml:space="preserve">Add legacy topics: non-SDK .csproj, packages.config offline restore, app.config + binding redirects, VS MSBuild discovery (vswhere), x86/x64/AnyCPU/Prefer32Bit, designer build actions, Dispatcher/STA/COM interop, net472 API availability.</w:t>
       </w:r>
     </w:p>
     <w:p>
@@ -1494,7 +1646,7 @@
         <w:pStyle w:val="Heading2"/>
       </w:pPr>
       <w:r>
-        <w:t xml:space="preserve">#7 — Knowledge audit + net472 topics</w:t>
+        <w:t xml:space="preserve">#8 — Build, transfer bundle (BOM), verification matrix</w:t>
       </w:r>
     </w:p>
     <w:p>
@@ -1506,7 +1658,7 @@
         </w:numPr>
       </w:pPr>
       <w:r>
-        <w:t xml:space="preserve">Create implementing-handrolled-mvvm topic (referenced by MvvmViolationDetector + agents).</w:t>
+        <w:t xml:space="preserve">Run setup.ps1 on an RTM 10.0.300+ machine; confirm both MCP servers start after a NuGet/uv cache cleanup.</w:t>
       </w:r>
     </w:p>
     <w:p>
@@ -1518,19 +1670,7 @@
         </w:numPr>
       </w:pPr>
       <w:r>
-        <w:t xml:space="preserve">Reconcile/replace CTK &amp; modern topics (implementing-communitytoolkit-mvvm, hosting-extensions-ai-chatclient, configuring-dependency-injection, ...).</w:t>
-      </w:r>
-    </w:p>
-    <w:p>
-      <w:pPr>
-        <w:pStyle w:val="ListParagraph"/>
-        <w:numPr>
-          <w:ilvl w:val="0"/>
-          <w:numId w:val="3"/>
-        </w:numPr>
-      </w:pPr>
-      <w:r>
-        <w:t xml:space="preserve">Add legacy topics: non-SDK .csproj, packages.config offline restore, app.config + binding redirects, VS MSBuild discovery (vswhere), x86/x64/AnyCPU/Prefer32Bit, designer build actions, Dispatcher/STA/COM interop/P-Invoke, net472 API availability checks.</w:t>
+        <w:t xml:space="preserve">Document the offline package set for representative solutions; execute the handoff doc's verification matrix on a network-blocked machine.</w:t>
       </w:r>
     </w:p>
     <w:p>
@@ -1538,50 +1678,6 @@
         <w:pStyle w:val="Heading2"/>
       </w:pPr>
       <w:r>
-        <w:t xml:space="preserve">#8 — Build, transfer bundle (BOM), verification matrix</w:t>
-      </w:r>
-    </w:p>
-    <w:p>
-      <w:pPr>
-        <w:pStyle w:val="ListParagraph"/>
-        <w:numPr>
-          <w:ilvl w:val="0"/>
-          <w:numId w:val="3"/>
-        </w:numPr>
-      </w:pPr>
-      <w:r>
-        <w:t xml:space="preserve">Run setup.ps1 / build-local-bin.ps1 on an RTM 10.0.300+ machine; confirm both MCP servers start after a NuGet/uv cache cleanup.</w:t>
-      </w:r>
-    </w:p>
-    <w:p>
-      <w:pPr>
-        <w:pStyle w:val="ListParagraph"/>
-        <w:numPr>
-          <w:ilvl w:val="0"/>
-          <w:numId w:val="3"/>
-        </w:numPr>
-      </w:pPr>
-      <w:r>
-        <w:t xml:space="preserve">Document the offline package set for representative solutions (net472/48 Developer Pack, VS Build Tools + vswhere, local NuGet folder feed, hashes/versions/licenses).</w:t>
-      </w:r>
-    </w:p>
-    <w:p>
-      <w:pPr>
-        <w:pStyle w:val="ListParagraph"/>
-        <w:numPr>
-          <w:ilvl w:val="0"/>
-          <w:numId w:val="3"/>
-        </w:numPr>
-      </w:pPr>
-      <w:r>
-        <w:t xml:space="preserve">Execute the handoff doc's verification matrix on a network-blocked machine; record evidence.</w:t>
-      </w:r>
-    </w:p>
-    <w:p>
-      <w:pPr>
-        <w:pStyle w:val="Heading2"/>
-      </w:pPr>
-      <w:r>
         <w:t xml:space="preserve">Deferred — Korean-mirror docs sync</w:t>
       </w:r>
     </w:p>
@@ -1590,7 +1686,7 @@
         <w:spacing w:after="120"/>
       </w:pPr>
       <w:r>
-        <w:t xml:space="preserve">English is authoritative. Still to mirror: README.ko.md (offline sections), .claude.ko/CLAUDE.md (MVVM Composition + .NET version + Essential), docs/TERMINOLOGY.ko.md. Also a fuller TERMINOLOGY.md rework (it still frames composition around CTK/Prism paths).</w:t>
+        <w:t xml:space="preserve">English is authoritative. Mirror README.ko.md, .claude.ko/CLAUDE.md (MVVM + .NET version sections), docs/TERMINOLOGY(.ko).md.</w:t>
       </w:r>
     </w:p>
     <w:p>
@@ -1614,7 +1710,7 @@
         <w:spacing w:after="120"/>
       </w:pPr>
       <w:r>
-        <w:t xml:space="preserve">The target PC has the .NET 10 RTM SDK, Claude Code, NuGet access, and VS MSBuild, so it builds everything itself — no pre-built binary transfer needed. git cannot auto-run a script on clone, so setup is ONE command:</w:t>
+        <w:t xml:space="preserve">The target PC has the .NET 10 RTM SDK, Claude Code, NuGet access, and VS MSBuild — it builds everything itself. git cannot auto-run a script on clone, so setup is ONE command:</w:t>
       </w:r>
     </w:p>
     <w:p>
@@ -1678,7 +1774,7 @@
         <w:spacing w:after="120"/>
       </w:pPr>
       <w:r>
-        <w:t xml:space="preserve">setup.ps1 verifies the RTM SDK, runs tools/build-local-bin.ps1 (publishes WpfDevPackMcp + vendors HandMirrorMcp/XamlStyler into bin/), and writes ~/.wpf-net472-airgap-dev-pack-mcp/config.json pointing the knowledge MCP at the clone (no set-repo-path needed). A SessionStart hook (BootstrapCheck.cs) reminds the user to run it if bin/ is missing. Re-run only after pulling new commits.</w:t>
+        <w:t xml:space="preserve">setup.ps1 builds bin/ (WpfDevPackMcp + HandMirrorMcp + XamlStyler) and writes config.json pointing the knowledge MCP at the clone (no set-repo-path needed). BootstrapCheck.cs reminds the user if bin/ is missing.</w:t>
       </w:r>
     </w:p>
     <w:p>
@@ -1736,7 +1832,7 @@
           <w:sz w:val="19"/>
           <w:szCs w:val="19"/>
         </w:rPr>
-        <w:t xml:space="preserve">Tasks #1-#5 + the clone bootstrap are done and committed. Start Task #6:</w:t>
+        <w:t xml:space="preserve">Tasks #1-#6 + the clone bootstrap are done and committed. Start Task #7:</w:t>
       </w:r>
     </w:p>
     <w:p>
@@ -1750,7 +1846,7 @@
           <w:sz w:val="19"/>
           <w:szCs w:val="19"/>
         </w:rPr>
-        <w:t xml:space="preserve">rewrite the make-wpf-* generators to emit net472/net48 + C#-7.3-safe code with</w:t>
+        <w:t xml:space="preserve">create the implementing-handrolled-mvvm knowledge topic, reconcile CTK/modern</w:t>
       </w:r>
     </w:p>
     <w:p>
@@ -1764,21 +1860,7 @@
           <w:sz w:val="19"/>
           <w:szCs w:val="19"/>
         </w:rPr>
-        <w:t xml:space="preserve">hand-rolled BindableBase/RelayCommand, and remove/defer the .NET 10 chat skills.</w:t>
-      </w:r>
-    </w:p>
-    <w:p>
-      <w:pPr>
-        <w:shd w:fill="F2F2F2" w:val="clear"/>
-        <w:spacing w:after="60"/>
-      </w:pPr>
-      <w:r>
-        <w:rPr>
-          <w:rFonts w:ascii="Consolas" w:cs="Consolas" w:eastAsia="Consolas" w:hAnsi="Consolas"/>
-          <w:sz w:val="19"/>
-          <w:szCs w:val="19"/>
-        </w:rPr>
-        <w:t xml:space="preserve">Do not modernize; do not reintroduce CommunityToolkit.</w:t>
+        <w:t xml:space="preserve">topics, and add net472 legacy topics. Do not modernize; no CommunityToolkit.</w:t>
       </w:r>
     </w:p>
     <w:sectPr>

</xml_diff>